<commit_message>
Leták pro lékaře a sestry: firemní grafika a logo Centra
Co-Authored-By: Claude Fable 5.1 <noreply@anthropic.com>
Claude-Session: https://claude.ai/code/session_01DHM73js1aX8r6xC8bdzJ6d
</commit_message>
<xml_diff>
--- a/docs/letak-pecedoma-karta-pacienta.docx
+++ b/docs/letak-pecedoma-karta-pacienta.docx
@@ -2,90 +2,192 @@
 <file path=word/document.xml><?xml version="1.0" encoding="utf-8"?>
 <w:document xmlns:wpc="http://schemas.microsoft.com/office/word/2010/wordprocessingCanvas" xmlns:mc="http://schemas.openxmlformats.org/markup-compatibility/2006" xmlns:o="urn:schemas-microsoft-com:office:office" xmlns:r="http://schemas.openxmlformats.org/officeDocument/2006/relationships" xmlns:m="http://schemas.openxmlformats.org/officeDocument/2006/math" xmlns:v="urn:schemas-microsoft-com:vml" xmlns:wp14="http://schemas.microsoft.com/office/word/2010/wordprocessingDrawing" xmlns:wp="http://schemas.openxmlformats.org/drawingml/2006/wordprocessingDrawing" xmlns:w10="urn:schemas-microsoft-com:office:word" xmlns:w="http://schemas.openxmlformats.org/wordprocessingml/2006/main" xmlns:w14="http://schemas.microsoft.com/office/word/2010/wordml" xmlns:w15="http://schemas.microsoft.com/office/word/2012/wordml" xmlns:wpg="http://schemas.microsoft.com/office/word/2010/wordprocessingGroup" xmlns:wpi="http://schemas.microsoft.com/office/word/2010/wordprocessingInk" xmlns:wne="http://schemas.microsoft.com/office/word/2006/wordml" xmlns:wps="http://schemas.microsoft.com/office/word/2010/wordprocessingShape" xmlns:cx="http://schemas.microsoft.com/office/drawing/2014/chartex" xmlns:cx1="http://schemas.microsoft.com/office/drawing/2015/9/8/chartex" xmlns:cx2="http://schemas.microsoft.com/office/drawing/2015/10/21/chartex" xmlns:cx3="http://schemas.microsoft.com/office/drawing/2016/5/9/chartex" xmlns:cx4="http://schemas.microsoft.com/office/drawing/2016/5/10/chartex" xmlns:cx5="http://schemas.microsoft.com/office/drawing/2016/5/11/chartex" xmlns:cx6="http://schemas.microsoft.com/office/drawing/2016/5/12/chartex" xmlns:cx7="http://schemas.microsoft.com/office/drawing/2016/5/13/chartex" xmlns:cx8="http://schemas.microsoft.com/office/drawing/2016/5/14/chartex" xmlns:aink="http://schemas.microsoft.com/office/drawing/2016/ink" xmlns:am3d="http://schemas.microsoft.com/office/drawing/2017/model3d" xmlns:w16cex="http://schemas.microsoft.com/office/word/2018/wordml/cex" xmlns:w16cid="http://schemas.microsoft.com/office/word/2016/wordml/cid" xmlns:w16="http://schemas.microsoft.com/office/word/2018/wordml" xmlns:w16sdtdh="http://schemas.microsoft.com/office/word/2020/wordml/sdtdatahash" xmlns:w16se="http://schemas.microsoft.com/office/word/2015/wordml/symex" mc:Ignorable="w14 w15 wp14">
   <w:body>
-    <w:p>
-      <w:pPr>
-        <w:spacing w:after="60"/>
+    <w:tbl>
+      <w:tblPr>
+        <w:tblW w:type="dxa" w:w="10100"/>
+        <w:tblBorders>
+          <w:top w:val="none" w:color="FFFFFF" w:sz="0"/>
+          <w:left w:val="none" w:color="FFFFFF" w:sz="0"/>
+          <w:bottom w:val="none" w:color="FFFFFF" w:sz="0"/>
+          <w:right w:val="none" w:color="FFFFFF" w:sz="0"/>
+          <w:insideH w:val="none" w:color="FFFFFF" w:sz="0"/>
+          <w:insideV w:val="none" w:color="FFFFFF" w:sz="0"/>
+        </w:tblBorders>
+      </w:tblPr>
+      <w:tblGrid>
+        <w:gridCol w:w="7300"/>
+        <w:gridCol w:w="2800"/>
+      </w:tblGrid>
+      <w:tr>
+        <w:tc>
+          <w:tcPr>
+            <w:tcW w:type="dxa" w:w="7300"/>
+            <w:tcMar>
+              <w:top w:type="dxa" w:w="0"/>
+              <w:left w:type="dxa" w:w="0"/>
+              <w:bottom w:type="dxa" w:w="0"/>
+              <w:right w:type="dxa" w:w="120"/>
+            </w:tcMar>
+            <w:vAlign w:val="center"/>
+          </w:tcPr>
+          <w:p>
+            <w:pPr>
+              <w:spacing w:after="60"/>
+            </w:pPr>
+            <w:r>
+              <w:rPr>
+                <w:rFonts w:ascii="Calibri" w:cs="Calibri" w:eastAsia="Calibri" w:hAnsi="Calibri"/>
+                <w:b/>
+                <w:bCs/>
+                <w:color w:val="D52B1E"/>
+                <w:spacing w:val="20"/>
+                <w:sz w:val="18"/>
+                <w:szCs w:val="18"/>
+              </w:rPr>
+              <w:t xml:space="preserve">INFORMATIVNÍ LETÁK PRO LÉKAŘE A SESTRY</w:t>
+            </w:r>
+          </w:p>
+          <w:p>
+            <w:pPr>
+              <w:spacing w:after="60"/>
+            </w:pPr>
+            <w:r>
+              <w:rPr>
+                <w:rFonts w:ascii="Calibri" w:cs="Calibri" w:eastAsia="Calibri" w:hAnsi="Calibri"/>
+                <w:b/>
+                <w:bCs/>
+                <w:color w:val="0060AA"/>
+                <w:sz w:val="36"/>
+                <w:szCs w:val="36"/>
+              </w:rPr>
+              <w:t xml:space="preserve">PéčeDoma a Karta pacienta on-line</w:t>
+            </w:r>
+          </w:p>
+          <w:p>
+            <w:pPr>
+              <w:spacing w:after="0"/>
+            </w:pPr>
+            <w:r>
+              <w:rPr>
+                <w:rFonts w:ascii="Calibri" w:cs="Calibri" w:eastAsia="Calibri" w:hAnsi="Calibri"/>
+                <w:color w:val="55657A"/>
+                <w:sz w:val="21"/>
+                <w:szCs w:val="21"/>
+              </w:rPr>
+              <w:t xml:space="preserve">K čemu každá aplikace slouží, jak spolu souvisejí a co v nich dělá lékař a sestra</w:t>
+            </w:r>
+          </w:p>
+        </w:tc>
+        <w:tc>
+          <w:tcPr>
+            <w:tcW w:type="dxa" w:w="2800"/>
+            <w:tcMar>
+              <w:top w:type="dxa" w:w="0"/>
+              <w:left w:type="dxa" w:w="0"/>
+              <w:bottom w:type="dxa" w:w="0"/>
+              <w:right w:type="dxa" w:w="0"/>
+            </w:tcMar>
+            <w:vAlign w:val="center"/>
+          </w:tcPr>
+          <w:p>
+            <w:pPr>
+              <w:spacing w:after="0"/>
+              <w:jc w:val="right"/>
+            </w:pPr>
+            <w:r>
+              <w:drawing>
+                <wp:inline distT="0" distB="0" distL="0" distR="0">
+                  <wp:extent cx="1428750" cy="895350"/>
+                  <wp:effectExtent t="0" r="0" b="0" l="0"/>
+                  <wp:docPr id="1" name="logo" descr="Centrum pro léčbu bolesti a paliativní medicínu Zlín" title="Logo"/>
+                  <wp:cNvGraphicFramePr>
+                    <a:graphicFrameLocks xmlns:a="http://schemas.openxmlformats.org/drawingml/2006/main" noChangeAspect="1"/>
+                  </wp:cNvGraphicFramePr>
+                  <a:graphic xmlns:a="http://schemas.openxmlformats.org/drawingml/2006/main">
+                    <a:graphicData uri="http://schemas.openxmlformats.org/drawingml/2006/picture">
+                      <pic:pic xmlns:pic="http://schemas.openxmlformats.org/drawingml/2006/picture">
+                        <pic:nvPicPr>
+                          <pic:cNvPr id="0" name="" descr=""/>
+                          <pic:cNvPicPr>
+                            <a:picLocks noChangeAspect="1" noChangeArrowheads="1"/>
+                          </pic:cNvPicPr>
+                        </pic:nvPicPr>
+                        <pic:blipFill>
+                          <a:blip r:embed="rId9" cstate="none"/>
+                          <a:srcRect/>
+                          <a:stretch>
+                            <a:fillRect/>
+                          </a:stretch>
+                        </pic:blipFill>
+                        <pic:spPr bwMode="auto">
+                          <a:xfrm>
+                            <a:off x="0" y="0"/>
+                            <a:ext cx="1428750" cy="895350"/>
+                          </a:xfrm>
+                          <a:prstGeom prst="rect">
+                            <a:avLst/>
+                          </a:prstGeom>
+                        </pic:spPr>
+                      </pic:pic>
+                    </a:graphicData>
+                  </a:graphic>
+                </wp:inline>
+              </w:drawing>
+            </w:r>
+          </w:p>
+        </w:tc>
+      </w:tr>
+    </w:tbl>
+    <w:p>
+      <w:pPr>
+        <w:pBdr>
+          <w:bottom w:val="single" w:color="0060AA" w:sz="18" w:space="4"/>
+        </w:pBdr>
+        <w:spacing w:after="120" w:before="60"/>
+      </w:pPr>
+      <w:r>
+        <w:rPr>
+          <w:rFonts w:ascii="Calibri" w:cs="Calibri" w:eastAsia="Calibri" w:hAnsi="Calibri"/>
+          <w:sz w:val="4"/>
+          <w:szCs w:val="4"/>
+        </w:rPr>
+        <w:t xml:space="preserve"/>
+      </w:r>
+    </w:p>
+    <w:p>
+      <w:pPr>
+        <w:spacing w:after="70" w:line="252"/>
       </w:pPr>
       <w:r>
         <w:rPr>
           <w:rFonts w:ascii="Calibri" w:cs="Calibri" w:eastAsia="Calibri" w:hAnsi="Calibri"/>
           <w:b/>
           <w:bCs/>
-          <w:color w:val="5A6B7D"/>
-          <w:spacing w:val="20"/>
-          <w:sz w:val="18"/>
-          <w:szCs w:val="18"/>
-        </w:rPr>
-        <w:t xml:space="preserve">INFORMATIVNÍ LETÁK PRO LÉKAŘE A SESTRY</w:t>
-      </w:r>
-    </w:p>
-    <w:p>
-      <w:pPr>
-        <w:spacing w:after="80"/>
+          <w:sz w:val="19"/>
+          <w:szCs w:val="19"/>
+        </w:rPr>
+        <w:t xml:space="preserve">Máme dvě aplikace, které spolu komunikují a tvoří jeden celek. </w:t>
+      </w:r>
+      <w:r>
+        <w:rPr>
+          <w:rFonts w:ascii="Calibri" w:cs="Calibri" w:eastAsia="Calibri" w:hAnsi="Calibri"/>
+          <w:sz w:val="19"/>
+          <w:szCs w:val="19"/>
+        </w:rPr>
+        <w:t xml:space="preserve">PéčeDoma je pracovní portál týmu – plánujeme, zapisujeme a sledujeme péči. Karta pacienta on-line je paliativní průkaz – to, co musí být u lůžka pro rodinu, záchrannou službu i lékaře ve službě, i bez signálu. Většinu práce dělá tým v PéčeDoma, Karta si z ní údaje bere sama.</w:t>
+      </w:r>
+    </w:p>
+    <w:p>
+      <w:pPr>
+        <w:pStyle w:val="Heading1"/>
+        <w:spacing w:after="70" w:before="160"/>
       </w:pPr>
       <w:r>
         <w:rPr>
           <w:rFonts w:ascii="Calibri" w:cs="Calibri" w:eastAsia="Calibri" w:hAnsi="Calibri"/>
           <w:b/>
           <w:bCs/>
-          <w:color w:val="1E6CB8"/>
-          <w:sz w:val="36"/>
-          <w:szCs w:val="36"/>
-        </w:rPr>
-        <w:t xml:space="preserve">PéčeDoma a Karta pacienta on-line</w:t>
-      </w:r>
-    </w:p>
-    <w:p>
-      <w:pPr>
-        <w:pBdr>
-          <w:bottom w:val="single" w:color="2E86D9" w:sz="12" w:space="4"/>
-        </w:pBdr>
-        <w:spacing w:after="120"/>
-      </w:pPr>
-      <w:r>
-        <w:rPr>
-          <w:rFonts w:ascii="Calibri" w:cs="Calibri" w:eastAsia="Calibri" w:hAnsi="Calibri"/>
-          <w:color w:val="5A6B7D"/>
-          <w:sz w:val="21"/>
-          <w:szCs w:val="21"/>
-        </w:rPr>
-        <w:t xml:space="preserve">K čemu každá aplikace slouží, jak spolu souvisejí a co v nich dělá lékař a sestra</w:t>
-      </w:r>
-    </w:p>
-    <w:p>
-      <w:pPr>
-        <w:spacing w:after="70" w:line="252"/>
-      </w:pPr>
-      <w:r>
-        <w:rPr>
-          <w:rFonts w:ascii="Calibri" w:cs="Calibri" w:eastAsia="Calibri" w:hAnsi="Calibri"/>
-          <w:b/>
-          <w:bCs/>
-          <w:sz w:val="19"/>
-          <w:szCs w:val="19"/>
-        </w:rPr>
-        <w:t xml:space="preserve">Máme dvě aplikace, které spolu komunikují a tvoří jeden celek. </w:t>
-      </w:r>
-      <w:r>
-        <w:rPr>
-          <w:rFonts w:ascii="Calibri" w:cs="Calibri" w:eastAsia="Calibri" w:hAnsi="Calibri"/>
-          <w:sz w:val="19"/>
-          <w:szCs w:val="19"/>
-        </w:rPr>
-        <w:t xml:space="preserve">PéčeDoma je pracovní portál týmu – plánujeme, zapisujeme a sledujeme péči. Karta pacienta on-line je paliativní průkaz – to, co musí být u lůžka pro rodinu, záchrannou službu i lékaře ve službě, i bez signálu. Většinu práce dělá tým v PéčeDoma, Karta si z ní údaje bere sama.</w:t>
-      </w:r>
-    </w:p>
-    <w:p>
-      <w:pPr>
-        <w:pStyle w:val="Heading1"/>
-        <w:spacing w:after="70" w:before="160"/>
-      </w:pPr>
-      <w:r>
-        <w:rPr>
-          <w:rFonts w:ascii="Calibri" w:cs="Calibri" w:eastAsia="Calibri" w:hAnsi="Calibri"/>
-          <w:b/>
-          <w:bCs/>
-          <w:color w:val="1E6CB8"/>
+          <w:color w:val="0060AA"/>
           <w:sz w:val="26"/>
           <w:szCs w:val="26"/>
         </w:rPr>
@@ -118,12 +220,12 @@
           <w:tcPr>
             <w:tcW w:type="dxa" w:w="1700"/>
             <w:tcBorders>
-              <w:top w:val="single" w:color="C9D9EA" w:sz="4"/>
-              <w:left w:val="single" w:color="C9D9EA" w:sz="4"/>
-              <w:bottom w:val="single" w:color="C9D9EA" w:sz="4"/>
-              <w:right w:val="single" w:color="C9D9EA" w:sz="4"/>
-            </w:tcBorders>
-            <w:shd w:fill="E3F1FC" w:color="auto" w:val="clear"/>
+              <w:top w:val="single" w:color="B9CDE3" w:sz="4"/>
+              <w:left w:val="single" w:color="B9CDE3" w:sz="4"/>
+              <w:bottom w:val="single" w:color="B9CDE3" w:sz="4"/>
+              <w:right w:val="single" w:color="B9CDE3" w:sz="4"/>
+            </w:tcBorders>
+            <w:shd w:fill="0060AA" w:color="auto" w:val="clear"/>
             <w:tcMar>
               <w:top w:type="dxa" w:w="40"/>
               <w:left w:type="dxa" w:w="90"/>
@@ -140,7 +242,7 @@
                 <w:rFonts w:ascii="Calibri" w:cs="Calibri" w:eastAsia="Calibri" w:hAnsi="Calibri"/>
                 <w:b/>
                 <w:bCs/>
-                <w:color w:val="1E6CB8"/>
+                <w:color w:val="FFFFFF"/>
                 <w:sz w:val="18"/>
                 <w:szCs w:val="18"/>
               </w:rPr>
@@ -152,12 +254,12 @@
           <w:tcPr>
             <w:tcW w:type="dxa" w:w="4200"/>
             <w:tcBorders>
-              <w:top w:val="single" w:color="C9D9EA" w:sz="4"/>
-              <w:left w:val="single" w:color="C9D9EA" w:sz="4"/>
-              <w:bottom w:val="single" w:color="C9D9EA" w:sz="4"/>
-              <w:right w:val="single" w:color="C9D9EA" w:sz="4"/>
-            </w:tcBorders>
-            <w:shd w:fill="E3F1FC" w:color="auto" w:val="clear"/>
+              <w:top w:val="single" w:color="B9CDE3" w:sz="4"/>
+              <w:left w:val="single" w:color="B9CDE3" w:sz="4"/>
+              <w:bottom w:val="single" w:color="B9CDE3" w:sz="4"/>
+              <w:right w:val="single" w:color="B9CDE3" w:sz="4"/>
+            </w:tcBorders>
+            <w:shd w:fill="0060AA" w:color="auto" w:val="clear"/>
             <w:tcMar>
               <w:top w:type="dxa" w:w="40"/>
               <w:left w:type="dxa" w:w="90"/>
@@ -174,7 +276,7 @@
                 <w:rFonts w:ascii="Calibri" w:cs="Calibri" w:eastAsia="Calibri" w:hAnsi="Calibri"/>
                 <w:b/>
                 <w:bCs/>
-                <w:color w:val="1E6CB8"/>
+                <w:color w:val="FFFFFF"/>
                 <w:sz w:val="18"/>
                 <w:szCs w:val="18"/>
               </w:rPr>
@@ -186,12 +288,12 @@
           <w:tcPr>
             <w:tcW w:type="dxa" w:w="4200"/>
             <w:tcBorders>
-              <w:top w:val="single" w:color="C9D9EA" w:sz="4"/>
-              <w:left w:val="single" w:color="C9D9EA" w:sz="4"/>
-              <w:bottom w:val="single" w:color="C9D9EA" w:sz="4"/>
-              <w:right w:val="single" w:color="C9D9EA" w:sz="4"/>
-            </w:tcBorders>
-            <w:shd w:fill="E3F1FC" w:color="auto" w:val="clear"/>
+              <w:top w:val="single" w:color="B9CDE3" w:sz="4"/>
+              <w:left w:val="single" w:color="B9CDE3" w:sz="4"/>
+              <w:bottom w:val="single" w:color="B9CDE3" w:sz="4"/>
+              <w:right w:val="single" w:color="B9CDE3" w:sz="4"/>
+            </w:tcBorders>
+            <w:shd w:fill="0060AA" w:color="auto" w:val="clear"/>
             <w:tcMar>
               <w:top w:type="dxa" w:w="40"/>
               <w:left w:type="dxa" w:w="90"/>
@@ -208,7 +310,7 @@
                 <w:rFonts w:ascii="Calibri" w:cs="Calibri" w:eastAsia="Calibri" w:hAnsi="Calibri"/>
                 <w:b/>
                 <w:bCs/>
-                <w:color w:val="1E6CB8"/>
+                <w:color w:val="FFFFFF"/>
                 <w:sz w:val="18"/>
                 <w:szCs w:val="18"/>
               </w:rPr>
@@ -226,10 +328,10 @@
           <w:tcPr>
             <w:tcW w:type="dxa" w:w="1700"/>
             <w:tcBorders>
-              <w:top w:val="single" w:color="C9D9EA" w:sz="4"/>
-              <w:left w:val="single" w:color="C9D9EA" w:sz="4"/>
-              <w:bottom w:val="single" w:color="C9D9EA" w:sz="4"/>
-              <w:right w:val="single" w:color="C9D9EA" w:sz="4"/>
+              <w:top w:val="single" w:color="B9CDE3" w:sz="4"/>
+              <w:left w:val="single" w:color="B9CDE3" w:sz="4"/>
+              <w:bottom w:val="single" w:color="B9CDE3" w:sz="4"/>
+              <w:right w:val="single" w:color="B9CDE3" w:sz="4"/>
             </w:tcBorders>
             <w:tcMar>
               <w:top w:type="dxa" w:w="40"/>
@@ -258,10 +360,10 @@
           <w:tcPr>
             <w:tcW w:type="dxa" w:w="4200"/>
             <w:tcBorders>
-              <w:top w:val="single" w:color="C9D9EA" w:sz="4"/>
-              <w:left w:val="single" w:color="C9D9EA" w:sz="4"/>
-              <w:bottom w:val="single" w:color="C9D9EA" w:sz="4"/>
-              <w:right w:val="single" w:color="C9D9EA" w:sz="4"/>
+              <w:top w:val="single" w:color="B9CDE3" w:sz="4"/>
+              <w:left w:val="single" w:color="B9CDE3" w:sz="4"/>
+              <w:bottom w:val="single" w:color="B9CDE3" w:sz="4"/>
+              <w:right w:val="single" w:color="B9CDE3" w:sz="4"/>
             </w:tcBorders>
             <w:tcMar>
               <w:top w:type="dxa" w:w="40"/>
@@ -290,10 +392,10 @@
           <w:tcPr>
             <w:tcW w:type="dxa" w:w="4200"/>
             <w:tcBorders>
-              <w:top w:val="single" w:color="C9D9EA" w:sz="4"/>
-              <w:left w:val="single" w:color="C9D9EA" w:sz="4"/>
-              <w:bottom w:val="single" w:color="C9D9EA" w:sz="4"/>
-              <w:right w:val="single" w:color="C9D9EA" w:sz="4"/>
+              <w:top w:val="single" w:color="B9CDE3" w:sz="4"/>
+              <w:left w:val="single" w:color="B9CDE3" w:sz="4"/>
+              <w:bottom w:val="single" w:color="B9CDE3" w:sz="4"/>
+              <w:right w:val="single" w:color="B9CDE3" w:sz="4"/>
             </w:tcBorders>
             <w:tcMar>
               <w:top w:type="dxa" w:w="40"/>
@@ -328,10 +430,10 @@
           <w:tcPr>
             <w:tcW w:type="dxa" w:w="1700"/>
             <w:tcBorders>
-              <w:top w:val="single" w:color="C9D9EA" w:sz="4"/>
-              <w:left w:val="single" w:color="C9D9EA" w:sz="4"/>
-              <w:bottom w:val="single" w:color="C9D9EA" w:sz="4"/>
-              <w:right w:val="single" w:color="C9D9EA" w:sz="4"/>
+              <w:top w:val="single" w:color="B9CDE3" w:sz="4"/>
+              <w:left w:val="single" w:color="B9CDE3" w:sz="4"/>
+              <w:bottom w:val="single" w:color="B9CDE3" w:sz="4"/>
+              <w:right w:val="single" w:color="B9CDE3" w:sz="4"/>
             </w:tcBorders>
             <w:tcMar>
               <w:top w:type="dxa" w:w="40"/>
@@ -360,10 +462,10 @@
           <w:tcPr>
             <w:tcW w:type="dxa" w:w="4200"/>
             <w:tcBorders>
-              <w:top w:val="single" w:color="C9D9EA" w:sz="4"/>
-              <w:left w:val="single" w:color="C9D9EA" w:sz="4"/>
-              <w:bottom w:val="single" w:color="C9D9EA" w:sz="4"/>
-              <w:right w:val="single" w:color="C9D9EA" w:sz="4"/>
+              <w:top w:val="single" w:color="B9CDE3" w:sz="4"/>
+              <w:left w:val="single" w:color="B9CDE3" w:sz="4"/>
+              <w:bottom w:val="single" w:color="B9CDE3" w:sz="4"/>
+              <w:right w:val="single" w:color="B9CDE3" w:sz="4"/>
             </w:tcBorders>
             <w:tcMar>
               <w:top w:type="dxa" w:w="40"/>
@@ -392,10 +494,10 @@
           <w:tcPr>
             <w:tcW w:type="dxa" w:w="4200"/>
             <w:tcBorders>
-              <w:top w:val="single" w:color="C9D9EA" w:sz="4"/>
-              <w:left w:val="single" w:color="C9D9EA" w:sz="4"/>
-              <w:bottom w:val="single" w:color="C9D9EA" w:sz="4"/>
-              <w:right w:val="single" w:color="C9D9EA" w:sz="4"/>
+              <w:top w:val="single" w:color="B9CDE3" w:sz="4"/>
+              <w:left w:val="single" w:color="B9CDE3" w:sz="4"/>
+              <w:bottom w:val="single" w:color="B9CDE3" w:sz="4"/>
+              <w:right w:val="single" w:color="B9CDE3" w:sz="4"/>
             </w:tcBorders>
             <w:tcMar>
               <w:top w:type="dxa" w:w="40"/>
@@ -430,10 +532,10 @@
           <w:tcPr>
             <w:tcW w:type="dxa" w:w="1700"/>
             <w:tcBorders>
-              <w:top w:val="single" w:color="C9D9EA" w:sz="4"/>
-              <w:left w:val="single" w:color="C9D9EA" w:sz="4"/>
-              <w:bottom w:val="single" w:color="C9D9EA" w:sz="4"/>
-              <w:right w:val="single" w:color="C9D9EA" w:sz="4"/>
+              <w:top w:val="single" w:color="B9CDE3" w:sz="4"/>
+              <w:left w:val="single" w:color="B9CDE3" w:sz="4"/>
+              <w:bottom w:val="single" w:color="B9CDE3" w:sz="4"/>
+              <w:right w:val="single" w:color="B9CDE3" w:sz="4"/>
             </w:tcBorders>
             <w:tcMar>
               <w:top w:type="dxa" w:w="40"/>
@@ -462,10 +564,10 @@
           <w:tcPr>
             <w:tcW w:type="dxa" w:w="4200"/>
             <w:tcBorders>
-              <w:top w:val="single" w:color="C9D9EA" w:sz="4"/>
-              <w:left w:val="single" w:color="C9D9EA" w:sz="4"/>
-              <w:bottom w:val="single" w:color="C9D9EA" w:sz="4"/>
-              <w:right w:val="single" w:color="C9D9EA" w:sz="4"/>
+              <w:top w:val="single" w:color="B9CDE3" w:sz="4"/>
+              <w:left w:val="single" w:color="B9CDE3" w:sz="4"/>
+              <w:bottom w:val="single" w:color="B9CDE3" w:sz="4"/>
+              <w:right w:val="single" w:color="B9CDE3" w:sz="4"/>
             </w:tcBorders>
             <w:tcMar>
               <w:top w:type="dxa" w:w="40"/>
@@ -494,10 +596,10 @@
           <w:tcPr>
             <w:tcW w:type="dxa" w:w="4200"/>
             <w:tcBorders>
-              <w:top w:val="single" w:color="C9D9EA" w:sz="4"/>
-              <w:left w:val="single" w:color="C9D9EA" w:sz="4"/>
-              <w:bottom w:val="single" w:color="C9D9EA" w:sz="4"/>
-              <w:right w:val="single" w:color="C9D9EA" w:sz="4"/>
+              <w:top w:val="single" w:color="B9CDE3" w:sz="4"/>
+              <w:left w:val="single" w:color="B9CDE3" w:sz="4"/>
+              <w:bottom w:val="single" w:color="B9CDE3" w:sz="4"/>
+              <w:right w:val="single" w:color="B9CDE3" w:sz="4"/>
             </w:tcBorders>
             <w:tcMar>
               <w:top w:type="dxa" w:w="40"/>
@@ -532,10 +634,10 @@
           <w:tcPr>
             <w:tcW w:type="dxa" w:w="1700"/>
             <w:tcBorders>
-              <w:top w:val="single" w:color="C9D9EA" w:sz="4"/>
-              <w:left w:val="single" w:color="C9D9EA" w:sz="4"/>
-              <w:bottom w:val="single" w:color="C9D9EA" w:sz="4"/>
-              <w:right w:val="single" w:color="C9D9EA" w:sz="4"/>
+              <w:top w:val="single" w:color="B9CDE3" w:sz="4"/>
+              <w:left w:val="single" w:color="B9CDE3" w:sz="4"/>
+              <w:bottom w:val="single" w:color="B9CDE3" w:sz="4"/>
+              <w:right w:val="single" w:color="B9CDE3" w:sz="4"/>
             </w:tcBorders>
             <w:tcMar>
               <w:top w:type="dxa" w:w="40"/>
@@ -564,10 +666,10 @@
           <w:tcPr>
             <w:tcW w:type="dxa" w:w="4200"/>
             <w:tcBorders>
-              <w:top w:val="single" w:color="C9D9EA" w:sz="4"/>
-              <w:left w:val="single" w:color="C9D9EA" w:sz="4"/>
-              <w:bottom w:val="single" w:color="C9D9EA" w:sz="4"/>
-              <w:right w:val="single" w:color="C9D9EA" w:sz="4"/>
+              <w:top w:val="single" w:color="B9CDE3" w:sz="4"/>
+              <w:left w:val="single" w:color="B9CDE3" w:sz="4"/>
+              <w:bottom w:val="single" w:color="B9CDE3" w:sz="4"/>
+              <w:right w:val="single" w:color="B9CDE3" w:sz="4"/>
             </w:tcBorders>
             <w:tcMar>
               <w:top w:type="dxa" w:w="40"/>
@@ -596,10 +698,10 @@
           <w:tcPr>
             <w:tcW w:type="dxa" w:w="4200"/>
             <w:tcBorders>
-              <w:top w:val="single" w:color="C9D9EA" w:sz="4"/>
-              <w:left w:val="single" w:color="C9D9EA" w:sz="4"/>
-              <w:bottom w:val="single" w:color="C9D9EA" w:sz="4"/>
-              <w:right w:val="single" w:color="C9D9EA" w:sz="4"/>
+              <w:top w:val="single" w:color="B9CDE3" w:sz="4"/>
+              <w:left w:val="single" w:color="B9CDE3" w:sz="4"/>
+              <w:bottom w:val="single" w:color="B9CDE3" w:sz="4"/>
+              <w:right w:val="single" w:color="B9CDE3" w:sz="4"/>
             </w:tcBorders>
             <w:tcMar>
               <w:top w:type="dxa" w:w="40"/>
@@ -636,7 +738,7 @@
           <w:rFonts w:ascii="Calibri" w:cs="Calibri" w:eastAsia="Calibri" w:hAnsi="Calibri"/>
           <w:b/>
           <w:bCs/>
-          <w:color w:val="1E6CB8"/>
+          <w:color w:val="0060AA"/>
           <w:sz w:val="26"/>
           <w:szCs w:val="26"/>
         </w:rPr>
@@ -804,7 +906,7 @@
           <w:rFonts w:ascii="Calibri" w:cs="Calibri" w:eastAsia="Calibri" w:hAnsi="Calibri"/>
           <w:b/>
           <w:bCs/>
-          <w:color w:val="1E6CB8"/>
+          <w:color w:val="0060AA"/>
           <w:sz w:val="26"/>
           <w:szCs w:val="26"/>
         </w:rPr>
@@ -849,12 +951,12 @@
           <w:tcPr>
             <w:tcW w:type="dxa" w:w="2300"/>
             <w:tcBorders>
-              <w:top w:val="single" w:color="C9D9EA" w:sz="4"/>
-              <w:left w:val="single" w:color="C9D9EA" w:sz="4"/>
-              <w:bottom w:val="single" w:color="C9D9EA" w:sz="4"/>
-              <w:right w:val="single" w:color="C9D9EA" w:sz="4"/>
-            </w:tcBorders>
-            <w:shd w:fill="E3F1FC" w:color="auto" w:val="clear"/>
+              <w:top w:val="single" w:color="B9CDE3" w:sz="4"/>
+              <w:left w:val="single" w:color="B9CDE3" w:sz="4"/>
+              <w:bottom w:val="single" w:color="B9CDE3" w:sz="4"/>
+              <w:right w:val="single" w:color="B9CDE3" w:sz="4"/>
+            </w:tcBorders>
+            <w:shd w:fill="0060AA" w:color="auto" w:val="clear"/>
             <w:tcMar>
               <w:top w:type="dxa" w:w="40"/>
               <w:left w:type="dxa" w:w="90"/>
@@ -871,7 +973,7 @@
                 <w:rFonts w:ascii="Calibri" w:cs="Calibri" w:eastAsia="Calibri" w:hAnsi="Calibri"/>
                 <w:b/>
                 <w:bCs/>
-                <w:color w:val="1E6CB8"/>
+                <w:color w:val="FFFFFF"/>
                 <w:sz w:val="18"/>
                 <w:szCs w:val="18"/>
               </w:rPr>
@@ -883,12 +985,12 @@
           <w:tcPr>
             <w:tcW w:type="dxa" w:w="7800"/>
             <w:tcBorders>
-              <w:top w:val="single" w:color="C9D9EA" w:sz="4"/>
-              <w:left w:val="single" w:color="C9D9EA" w:sz="4"/>
-              <w:bottom w:val="single" w:color="C9D9EA" w:sz="4"/>
-              <w:right w:val="single" w:color="C9D9EA" w:sz="4"/>
-            </w:tcBorders>
-            <w:shd w:fill="E3F1FC" w:color="auto" w:val="clear"/>
+              <w:top w:val="single" w:color="B9CDE3" w:sz="4"/>
+              <w:left w:val="single" w:color="B9CDE3" w:sz="4"/>
+              <w:bottom w:val="single" w:color="B9CDE3" w:sz="4"/>
+              <w:right w:val="single" w:color="B9CDE3" w:sz="4"/>
+            </w:tcBorders>
+            <w:shd w:fill="0060AA" w:color="auto" w:val="clear"/>
             <w:tcMar>
               <w:top w:type="dxa" w:w="40"/>
               <w:left w:type="dxa" w:w="90"/>
@@ -905,7 +1007,7 @@
                 <w:rFonts w:ascii="Calibri" w:cs="Calibri" w:eastAsia="Calibri" w:hAnsi="Calibri"/>
                 <w:b/>
                 <w:bCs/>
-                <w:color w:val="1E6CB8"/>
+                <w:color w:val="FFFFFF"/>
                 <w:sz w:val="18"/>
                 <w:szCs w:val="18"/>
               </w:rPr>
@@ -923,10 +1025,10 @@
           <w:tcPr>
             <w:tcW w:type="dxa" w:w="2300"/>
             <w:tcBorders>
-              <w:top w:val="single" w:color="C9D9EA" w:sz="4"/>
-              <w:left w:val="single" w:color="C9D9EA" w:sz="4"/>
-              <w:bottom w:val="single" w:color="C9D9EA" w:sz="4"/>
-              <w:right w:val="single" w:color="C9D9EA" w:sz="4"/>
+              <w:top w:val="single" w:color="B9CDE3" w:sz="4"/>
+              <w:left w:val="single" w:color="B9CDE3" w:sz="4"/>
+              <w:bottom w:val="single" w:color="B9CDE3" w:sz="4"/>
+              <w:right w:val="single" w:color="B9CDE3" w:sz="4"/>
             </w:tcBorders>
             <w:tcMar>
               <w:top w:type="dxa" w:w="40"/>
@@ -955,10 +1057,10 @@
           <w:tcPr>
             <w:tcW w:type="dxa" w:w="7800"/>
             <w:tcBorders>
-              <w:top w:val="single" w:color="C9D9EA" w:sz="4"/>
-              <w:left w:val="single" w:color="C9D9EA" w:sz="4"/>
-              <w:bottom w:val="single" w:color="C9D9EA" w:sz="4"/>
-              <w:right w:val="single" w:color="C9D9EA" w:sz="4"/>
+              <w:top w:val="single" w:color="B9CDE3" w:sz="4"/>
+              <w:left w:val="single" w:color="B9CDE3" w:sz="4"/>
+              <w:bottom w:val="single" w:color="B9CDE3" w:sz="4"/>
+              <w:right w:val="single" w:color="B9CDE3" w:sz="4"/>
             </w:tcBorders>
             <w:tcMar>
               <w:top w:type="dxa" w:w="40"/>
@@ -993,10 +1095,10 @@
           <w:tcPr>
             <w:tcW w:type="dxa" w:w="2300"/>
             <w:tcBorders>
-              <w:top w:val="single" w:color="C9D9EA" w:sz="4"/>
-              <w:left w:val="single" w:color="C9D9EA" w:sz="4"/>
-              <w:bottom w:val="single" w:color="C9D9EA" w:sz="4"/>
-              <w:right w:val="single" w:color="C9D9EA" w:sz="4"/>
+              <w:top w:val="single" w:color="B9CDE3" w:sz="4"/>
+              <w:left w:val="single" w:color="B9CDE3" w:sz="4"/>
+              <w:bottom w:val="single" w:color="B9CDE3" w:sz="4"/>
+              <w:right w:val="single" w:color="B9CDE3" w:sz="4"/>
             </w:tcBorders>
             <w:tcMar>
               <w:top w:type="dxa" w:w="40"/>
@@ -1025,10 +1127,10 @@
           <w:tcPr>
             <w:tcW w:type="dxa" w:w="7800"/>
             <w:tcBorders>
-              <w:top w:val="single" w:color="C9D9EA" w:sz="4"/>
-              <w:left w:val="single" w:color="C9D9EA" w:sz="4"/>
-              <w:bottom w:val="single" w:color="C9D9EA" w:sz="4"/>
-              <w:right w:val="single" w:color="C9D9EA" w:sz="4"/>
+              <w:top w:val="single" w:color="B9CDE3" w:sz="4"/>
+              <w:left w:val="single" w:color="B9CDE3" w:sz="4"/>
+              <w:bottom w:val="single" w:color="B9CDE3" w:sz="4"/>
+              <w:right w:val="single" w:color="B9CDE3" w:sz="4"/>
             </w:tcBorders>
             <w:tcMar>
               <w:top w:type="dxa" w:w="40"/>
@@ -1063,10 +1165,10 @@
           <w:tcPr>
             <w:tcW w:type="dxa" w:w="2300"/>
             <w:tcBorders>
-              <w:top w:val="single" w:color="C9D9EA" w:sz="4"/>
-              <w:left w:val="single" w:color="C9D9EA" w:sz="4"/>
-              <w:bottom w:val="single" w:color="C9D9EA" w:sz="4"/>
-              <w:right w:val="single" w:color="C9D9EA" w:sz="4"/>
+              <w:top w:val="single" w:color="B9CDE3" w:sz="4"/>
+              <w:left w:val="single" w:color="B9CDE3" w:sz="4"/>
+              <w:bottom w:val="single" w:color="B9CDE3" w:sz="4"/>
+              <w:right w:val="single" w:color="B9CDE3" w:sz="4"/>
             </w:tcBorders>
             <w:tcMar>
               <w:top w:type="dxa" w:w="40"/>
@@ -1095,10 +1197,10 @@
           <w:tcPr>
             <w:tcW w:type="dxa" w:w="7800"/>
             <w:tcBorders>
-              <w:top w:val="single" w:color="C9D9EA" w:sz="4"/>
-              <w:left w:val="single" w:color="C9D9EA" w:sz="4"/>
-              <w:bottom w:val="single" w:color="C9D9EA" w:sz="4"/>
-              <w:right w:val="single" w:color="C9D9EA" w:sz="4"/>
+              <w:top w:val="single" w:color="B9CDE3" w:sz="4"/>
+              <w:left w:val="single" w:color="B9CDE3" w:sz="4"/>
+              <w:bottom w:val="single" w:color="B9CDE3" w:sz="4"/>
+              <w:right w:val="single" w:color="B9CDE3" w:sz="4"/>
             </w:tcBorders>
             <w:tcMar>
               <w:top w:type="dxa" w:w="40"/>
@@ -1135,7 +1237,7 @@
           <w:rFonts w:ascii="Calibri" w:cs="Calibri" w:eastAsia="Calibri" w:hAnsi="Calibri"/>
           <w:b/>
           <w:bCs/>
-          <w:color w:val="1E6CB8"/>
+          <w:color w:val="0060AA"/>
           <w:sz w:val="21"/>
           <w:szCs w:val="21"/>
         </w:rPr>
@@ -1244,7 +1346,7 @@
           <w:rFonts w:ascii="Calibri" w:cs="Calibri" w:eastAsia="Calibri" w:hAnsi="Calibri"/>
           <w:b/>
           <w:bCs/>
-          <w:color w:val="1E6CB8"/>
+          <w:color w:val="0060AA"/>
           <w:sz w:val="21"/>
           <w:szCs w:val="21"/>
         </w:rPr>
@@ -1274,7 +1376,7 @@
           <w:rFonts w:ascii="Calibri" w:cs="Calibri" w:eastAsia="Calibri" w:hAnsi="Calibri"/>
           <w:b/>
           <w:bCs/>
-          <w:color w:val="1E6CB8"/>
+          <w:color w:val="0060AA"/>
           <w:sz w:val="26"/>
           <w:szCs w:val="26"/>
         </w:rPr>
@@ -1307,12 +1409,12 @@
           <w:tcPr>
             <w:tcW w:type="dxa" w:w="3000"/>
             <w:tcBorders>
-              <w:top w:val="single" w:color="C9D9EA" w:sz="4"/>
-              <w:left w:val="single" w:color="C9D9EA" w:sz="4"/>
-              <w:bottom w:val="single" w:color="C9D9EA" w:sz="4"/>
-              <w:right w:val="single" w:color="C9D9EA" w:sz="4"/>
-            </w:tcBorders>
-            <w:shd w:fill="E3F1FC" w:color="auto" w:val="clear"/>
+              <w:top w:val="single" w:color="B9CDE3" w:sz="4"/>
+              <w:left w:val="single" w:color="B9CDE3" w:sz="4"/>
+              <w:bottom w:val="single" w:color="B9CDE3" w:sz="4"/>
+              <w:right w:val="single" w:color="B9CDE3" w:sz="4"/>
+            </w:tcBorders>
+            <w:shd w:fill="0060AA" w:color="auto" w:val="clear"/>
             <w:tcMar>
               <w:top w:type="dxa" w:w="40"/>
               <w:left w:type="dxa" w:w="90"/>
@@ -1329,7 +1431,7 @@
                 <w:rFonts w:ascii="Calibri" w:cs="Calibri" w:eastAsia="Calibri" w:hAnsi="Calibri"/>
                 <w:b/>
                 <w:bCs/>
-                <w:color w:val="1E6CB8"/>
+                <w:color w:val="FFFFFF"/>
                 <w:sz w:val="18"/>
                 <w:szCs w:val="18"/>
               </w:rPr>
@@ -1341,12 +1443,12 @@
           <w:tcPr>
             <w:tcW w:type="dxa" w:w="1700"/>
             <w:tcBorders>
-              <w:top w:val="single" w:color="C9D9EA" w:sz="4"/>
-              <w:left w:val="single" w:color="C9D9EA" w:sz="4"/>
-              <w:bottom w:val="single" w:color="C9D9EA" w:sz="4"/>
-              <w:right w:val="single" w:color="C9D9EA" w:sz="4"/>
-            </w:tcBorders>
-            <w:shd w:fill="E3F1FC" w:color="auto" w:val="clear"/>
+              <w:top w:val="single" w:color="B9CDE3" w:sz="4"/>
+              <w:left w:val="single" w:color="B9CDE3" w:sz="4"/>
+              <w:bottom w:val="single" w:color="B9CDE3" w:sz="4"/>
+              <w:right w:val="single" w:color="B9CDE3" w:sz="4"/>
+            </w:tcBorders>
+            <w:shd w:fill="0060AA" w:color="auto" w:val="clear"/>
             <w:tcMar>
               <w:top w:type="dxa" w:w="40"/>
               <w:left w:type="dxa" w:w="90"/>
@@ -1363,7 +1465,7 @@
                 <w:rFonts w:ascii="Calibri" w:cs="Calibri" w:eastAsia="Calibri" w:hAnsi="Calibri"/>
                 <w:b/>
                 <w:bCs/>
-                <w:color w:val="1E6CB8"/>
+                <w:color w:val="FFFFFF"/>
                 <w:sz w:val="18"/>
                 <w:szCs w:val="18"/>
               </w:rPr>
@@ -1375,12 +1477,12 @@
           <w:tcPr>
             <w:tcW w:type="dxa" w:w="5400"/>
             <w:tcBorders>
-              <w:top w:val="single" w:color="C9D9EA" w:sz="4"/>
-              <w:left w:val="single" w:color="C9D9EA" w:sz="4"/>
-              <w:bottom w:val="single" w:color="C9D9EA" w:sz="4"/>
-              <w:right w:val="single" w:color="C9D9EA" w:sz="4"/>
-            </w:tcBorders>
-            <w:shd w:fill="E3F1FC" w:color="auto" w:val="clear"/>
+              <w:top w:val="single" w:color="B9CDE3" w:sz="4"/>
+              <w:left w:val="single" w:color="B9CDE3" w:sz="4"/>
+              <w:bottom w:val="single" w:color="B9CDE3" w:sz="4"/>
+              <w:right w:val="single" w:color="B9CDE3" w:sz="4"/>
+            </w:tcBorders>
+            <w:shd w:fill="0060AA" w:color="auto" w:val="clear"/>
             <w:tcMar>
               <w:top w:type="dxa" w:w="40"/>
               <w:left w:type="dxa" w:w="90"/>
@@ -1397,7 +1499,7 @@
                 <w:rFonts w:ascii="Calibri" w:cs="Calibri" w:eastAsia="Calibri" w:hAnsi="Calibri"/>
                 <w:b/>
                 <w:bCs/>
-                <w:color w:val="1E6CB8"/>
+                <w:color w:val="FFFFFF"/>
                 <w:sz w:val="18"/>
                 <w:szCs w:val="18"/>
               </w:rPr>
@@ -1415,10 +1517,10 @@
           <w:tcPr>
             <w:tcW w:type="dxa" w:w="3000"/>
             <w:tcBorders>
-              <w:top w:val="single" w:color="C9D9EA" w:sz="4"/>
-              <w:left w:val="single" w:color="C9D9EA" w:sz="4"/>
-              <w:bottom w:val="single" w:color="C9D9EA" w:sz="4"/>
-              <w:right w:val="single" w:color="C9D9EA" w:sz="4"/>
+              <w:top w:val="single" w:color="B9CDE3" w:sz="4"/>
+              <w:left w:val="single" w:color="B9CDE3" w:sz="4"/>
+              <w:bottom w:val="single" w:color="B9CDE3" w:sz="4"/>
+              <w:right w:val="single" w:color="B9CDE3" w:sz="4"/>
             </w:tcBorders>
             <w:tcMar>
               <w:top w:type="dxa" w:w="40"/>
@@ -1447,10 +1549,10 @@
           <w:tcPr>
             <w:tcW w:type="dxa" w:w="1700"/>
             <w:tcBorders>
-              <w:top w:val="single" w:color="C9D9EA" w:sz="4"/>
-              <w:left w:val="single" w:color="C9D9EA" w:sz="4"/>
-              <w:bottom w:val="single" w:color="C9D9EA" w:sz="4"/>
-              <w:right w:val="single" w:color="C9D9EA" w:sz="4"/>
+              <w:top w:val="single" w:color="B9CDE3" w:sz="4"/>
+              <w:left w:val="single" w:color="B9CDE3" w:sz="4"/>
+              <w:bottom w:val="single" w:color="B9CDE3" w:sz="4"/>
+              <w:right w:val="single" w:color="B9CDE3" w:sz="4"/>
             </w:tcBorders>
             <w:tcMar>
               <w:top w:type="dxa" w:w="40"/>
@@ -1479,10 +1581,10 @@
           <w:tcPr>
             <w:tcW w:type="dxa" w:w="5400"/>
             <w:tcBorders>
-              <w:top w:val="single" w:color="C9D9EA" w:sz="4"/>
-              <w:left w:val="single" w:color="C9D9EA" w:sz="4"/>
-              <w:bottom w:val="single" w:color="C9D9EA" w:sz="4"/>
-              <w:right w:val="single" w:color="C9D9EA" w:sz="4"/>
+              <w:top w:val="single" w:color="B9CDE3" w:sz="4"/>
+              <w:left w:val="single" w:color="B9CDE3" w:sz="4"/>
+              <w:bottom w:val="single" w:color="B9CDE3" w:sz="4"/>
+              <w:right w:val="single" w:color="B9CDE3" w:sz="4"/>
             </w:tcBorders>
             <w:tcMar>
               <w:top w:type="dxa" w:w="40"/>
@@ -1517,10 +1619,10 @@
           <w:tcPr>
             <w:tcW w:type="dxa" w:w="3000"/>
             <w:tcBorders>
-              <w:top w:val="single" w:color="C9D9EA" w:sz="4"/>
-              <w:left w:val="single" w:color="C9D9EA" w:sz="4"/>
-              <w:bottom w:val="single" w:color="C9D9EA" w:sz="4"/>
-              <w:right w:val="single" w:color="C9D9EA" w:sz="4"/>
+              <w:top w:val="single" w:color="B9CDE3" w:sz="4"/>
+              <w:left w:val="single" w:color="B9CDE3" w:sz="4"/>
+              <w:bottom w:val="single" w:color="B9CDE3" w:sz="4"/>
+              <w:right w:val="single" w:color="B9CDE3" w:sz="4"/>
             </w:tcBorders>
             <w:tcMar>
               <w:top w:type="dxa" w:w="40"/>
@@ -1549,10 +1651,10 @@
           <w:tcPr>
             <w:tcW w:type="dxa" w:w="1700"/>
             <w:tcBorders>
-              <w:top w:val="single" w:color="C9D9EA" w:sz="4"/>
-              <w:left w:val="single" w:color="C9D9EA" w:sz="4"/>
-              <w:bottom w:val="single" w:color="C9D9EA" w:sz="4"/>
-              <w:right w:val="single" w:color="C9D9EA" w:sz="4"/>
+              <w:top w:val="single" w:color="B9CDE3" w:sz="4"/>
+              <w:left w:val="single" w:color="B9CDE3" w:sz="4"/>
+              <w:bottom w:val="single" w:color="B9CDE3" w:sz="4"/>
+              <w:right w:val="single" w:color="B9CDE3" w:sz="4"/>
             </w:tcBorders>
             <w:tcMar>
               <w:top w:type="dxa" w:w="40"/>
@@ -1581,10 +1683,10 @@
           <w:tcPr>
             <w:tcW w:type="dxa" w:w="5400"/>
             <w:tcBorders>
-              <w:top w:val="single" w:color="C9D9EA" w:sz="4"/>
-              <w:left w:val="single" w:color="C9D9EA" w:sz="4"/>
-              <w:bottom w:val="single" w:color="C9D9EA" w:sz="4"/>
-              <w:right w:val="single" w:color="C9D9EA" w:sz="4"/>
+              <w:top w:val="single" w:color="B9CDE3" w:sz="4"/>
+              <w:left w:val="single" w:color="B9CDE3" w:sz="4"/>
+              <w:bottom w:val="single" w:color="B9CDE3" w:sz="4"/>
+              <w:right w:val="single" w:color="B9CDE3" w:sz="4"/>
             </w:tcBorders>
             <w:tcMar>
               <w:top w:type="dxa" w:w="40"/>
@@ -1619,10 +1721,10 @@
           <w:tcPr>
             <w:tcW w:type="dxa" w:w="3000"/>
             <w:tcBorders>
-              <w:top w:val="single" w:color="C9D9EA" w:sz="4"/>
-              <w:left w:val="single" w:color="C9D9EA" w:sz="4"/>
-              <w:bottom w:val="single" w:color="C9D9EA" w:sz="4"/>
-              <w:right w:val="single" w:color="C9D9EA" w:sz="4"/>
+              <w:top w:val="single" w:color="B9CDE3" w:sz="4"/>
+              <w:left w:val="single" w:color="B9CDE3" w:sz="4"/>
+              <w:bottom w:val="single" w:color="B9CDE3" w:sz="4"/>
+              <w:right w:val="single" w:color="B9CDE3" w:sz="4"/>
             </w:tcBorders>
             <w:tcMar>
               <w:top w:type="dxa" w:w="40"/>
@@ -1651,10 +1753,10 @@
           <w:tcPr>
             <w:tcW w:type="dxa" w:w="1700"/>
             <w:tcBorders>
-              <w:top w:val="single" w:color="C9D9EA" w:sz="4"/>
-              <w:left w:val="single" w:color="C9D9EA" w:sz="4"/>
-              <w:bottom w:val="single" w:color="C9D9EA" w:sz="4"/>
-              <w:right w:val="single" w:color="C9D9EA" w:sz="4"/>
+              <w:top w:val="single" w:color="B9CDE3" w:sz="4"/>
+              <w:left w:val="single" w:color="B9CDE3" w:sz="4"/>
+              <w:bottom w:val="single" w:color="B9CDE3" w:sz="4"/>
+              <w:right w:val="single" w:color="B9CDE3" w:sz="4"/>
             </w:tcBorders>
             <w:tcMar>
               <w:top w:type="dxa" w:w="40"/>
@@ -1683,10 +1785,10 @@
           <w:tcPr>
             <w:tcW w:type="dxa" w:w="5400"/>
             <w:tcBorders>
-              <w:top w:val="single" w:color="C9D9EA" w:sz="4"/>
-              <w:left w:val="single" w:color="C9D9EA" w:sz="4"/>
-              <w:bottom w:val="single" w:color="C9D9EA" w:sz="4"/>
-              <w:right w:val="single" w:color="C9D9EA" w:sz="4"/>
+              <w:top w:val="single" w:color="B9CDE3" w:sz="4"/>
+              <w:left w:val="single" w:color="B9CDE3" w:sz="4"/>
+              <w:bottom w:val="single" w:color="B9CDE3" w:sz="4"/>
+              <w:right w:val="single" w:color="B9CDE3" w:sz="4"/>
             </w:tcBorders>
             <w:tcMar>
               <w:top w:type="dxa" w:w="40"/>
@@ -1721,10 +1823,10 @@
           <w:tcPr>
             <w:tcW w:type="dxa" w:w="3000"/>
             <w:tcBorders>
-              <w:top w:val="single" w:color="C9D9EA" w:sz="4"/>
-              <w:left w:val="single" w:color="C9D9EA" w:sz="4"/>
-              <w:bottom w:val="single" w:color="C9D9EA" w:sz="4"/>
-              <w:right w:val="single" w:color="C9D9EA" w:sz="4"/>
+              <w:top w:val="single" w:color="B9CDE3" w:sz="4"/>
+              <w:left w:val="single" w:color="B9CDE3" w:sz="4"/>
+              <w:bottom w:val="single" w:color="B9CDE3" w:sz="4"/>
+              <w:right w:val="single" w:color="B9CDE3" w:sz="4"/>
             </w:tcBorders>
             <w:tcMar>
               <w:top w:type="dxa" w:w="40"/>
@@ -1753,10 +1855,10 @@
           <w:tcPr>
             <w:tcW w:type="dxa" w:w="1700"/>
             <w:tcBorders>
-              <w:top w:val="single" w:color="C9D9EA" w:sz="4"/>
-              <w:left w:val="single" w:color="C9D9EA" w:sz="4"/>
-              <w:bottom w:val="single" w:color="C9D9EA" w:sz="4"/>
-              <w:right w:val="single" w:color="C9D9EA" w:sz="4"/>
+              <w:top w:val="single" w:color="B9CDE3" w:sz="4"/>
+              <w:left w:val="single" w:color="B9CDE3" w:sz="4"/>
+              <w:bottom w:val="single" w:color="B9CDE3" w:sz="4"/>
+              <w:right w:val="single" w:color="B9CDE3" w:sz="4"/>
             </w:tcBorders>
             <w:tcMar>
               <w:top w:type="dxa" w:w="40"/>
@@ -1785,10 +1887,10 @@
           <w:tcPr>
             <w:tcW w:type="dxa" w:w="5400"/>
             <w:tcBorders>
-              <w:top w:val="single" w:color="C9D9EA" w:sz="4"/>
-              <w:left w:val="single" w:color="C9D9EA" w:sz="4"/>
-              <w:bottom w:val="single" w:color="C9D9EA" w:sz="4"/>
-              <w:right w:val="single" w:color="C9D9EA" w:sz="4"/>
+              <w:top w:val="single" w:color="B9CDE3" w:sz="4"/>
+              <w:left w:val="single" w:color="B9CDE3" w:sz="4"/>
+              <w:bottom w:val="single" w:color="B9CDE3" w:sz="4"/>
+              <w:right w:val="single" w:color="B9CDE3" w:sz="4"/>
             </w:tcBorders>
             <w:tcMar>
               <w:top w:type="dxa" w:w="40"/>
@@ -1823,10 +1925,10 @@
           <w:tcPr>
             <w:tcW w:type="dxa" w:w="3000"/>
             <w:tcBorders>
-              <w:top w:val="single" w:color="C9D9EA" w:sz="4"/>
-              <w:left w:val="single" w:color="C9D9EA" w:sz="4"/>
-              <w:bottom w:val="single" w:color="C9D9EA" w:sz="4"/>
-              <w:right w:val="single" w:color="C9D9EA" w:sz="4"/>
+              <w:top w:val="single" w:color="B9CDE3" w:sz="4"/>
+              <w:left w:val="single" w:color="B9CDE3" w:sz="4"/>
+              <w:bottom w:val="single" w:color="B9CDE3" w:sz="4"/>
+              <w:right w:val="single" w:color="B9CDE3" w:sz="4"/>
             </w:tcBorders>
             <w:tcMar>
               <w:top w:type="dxa" w:w="40"/>
@@ -1855,10 +1957,10 @@
           <w:tcPr>
             <w:tcW w:type="dxa" w:w="1700"/>
             <w:tcBorders>
-              <w:top w:val="single" w:color="C9D9EA" w:sz="4"/>
-              <w:left w:val="single" w:color="C9D9EA" w:sz="4"/>
-              <w:bottom w:val="single" w:color="C9D9EA" w:sz="4"/>
-              <w:right w:val="single" w:color="C9D9EA" w:sz="4"/>
+              <w:top w:val="single" w:color="B9CDE3" w:sz="4"/>
+              <w:left w:val="single" w:color="B9CDE3" w:sz="4"/>
+              <w:bottom w:val="single" w:color="B9CDE3" w:sz="4"/>
+              <w:right w:val="single" w:color="B9CDE3" w:sz="4"/>
             </w:tcBorders>
             <w:tcMar>
               <w:top w:type="dxa" w:w="40"/>
@@ -1887,10 +1989,10 @@
           <w:tcPr>
             <w:tcW w:type="dxa" w:w="5400"/>
             <w:tcBorders>
-              <w:top w:val="single" w:color="C9D9EA" w:sz="4"/>
-              <w:left w:val="single" w:color="C9D9EA" w:sz="4"/>
-              <w:bottom w:val="single" w:color="C9D9EA" w:sz="4"/>
-              <w:right w:val="single" w:color="C9D9EA" w:sz="4"/>
+              <w:top w:val="single" w:color="B9CDE3" w:sz="4"/>
+              <w:left w:val="single" w:color="B9CDE3" w:sz="4"/>
+              <w:bottom w:val="single" w:color="B9CDE3" w:sz="4"/>
+              <w:right w:val="single" w:color="B9CDE3" w:sz="4"/>
             </w:tcBorders>
             <w:tcMar>
               <w:top w:type="dxa" w:w="40"/>
@@ -1927,7 +2029,7 @@
           <w:rFonts w:ascii="Calibri" w:cs="Calibri" w:eastAsia="Calibri" w:hAnsi="Calibri"/>
           <w:b/>
           <w:bCs/>
-          <w:color w:val="1E6CB8"/>
+          <w:color w:val="0060AA"/>
           <w:sz w:val="26"/>
           <w:szCs w:val="26"/>
         </w:rPr>
@@ -1944,7 +2046,7 @@
           <w:rFonts w:ascii="Calibri" w:cs="Calibri" w:eastAsia="Calibri" w:hAnsi="Calibri"/>
           <w:b/>
           <w:bCs/>
-          <w:color w:val="1E6CB8"/>
+          <w:color w:val="0060AA"/>
           <w:sz w:val="21"/>
           <w:szCs w:val="21"/>
         </w:rPr>
@@ -1997,7 +2099,7 @@
           <w:rFonts w:ascii="Calibri" w:cs="Calibri" w:eastAsia="Calibri" w:hAnsi="Calibri"/>
           <w:b/>
           <w:bCs/>
-          <w:color w:val="1E6CB8"/>
+          <w:color w:val="0060AA"/>
           <w:sz w:val="21"/>
           <w:szCs w:val="21"/>
         </w:rPr>
@@ -2032,7 +2134,7 @@
           <w:rFonts w:ascii="Calibri" w:cs="Calibri" w:eastAsia="Calibri" w:hAnsi="Calibri"/>
           <w:b/>
           <w:bCs/>
-          <w:color w:val="1E6CB8"/>
+          <w:color w:val="0060AA"/>
           <w:sz w:val="21"/>
           <w:szCs w:val="21"/>
         </w:rPr>
@@ -2067,7 +2169,7 @@
           <w:rFonts w:ascii="Calibri" w:cs="Calibri" w:eastAsia="Calibri" w:hAnsi="Calibri"/>
           <w:b/>
           <w:bCs/>
-          <w:color w:val="1E6CB8"/>
+          <w:color w:val="0060AA"/>
           <w:sz w:val="21"/>
           <w:szCs w:val="21"/>
         </w:rPr>
@@ -2102,7 +2204,7 @@
           <w:rFonts w:ascii="Calibri" w:cs="Calibri" w:eastAsia="Calibri" w:hAnsi="Calibri"/>
           <w:b/>
           <w:bCs/>
-          <w:color w:val="1E6CB8"/>
+          <w:color w:val="0060AA"/>
           <w:sz w:val="21"/>
           <w:szCs w:val="21"/>
         </w:rPr>
@@ -2137,7 +2239,7 @@
           <w:rFonts w:ascii="Calibri" w:cs="Calibri" w:eastAsia="Calibri" w:hAnsi="Calibri"/>
           <w:b/>
           <w:bCs/>
-          <w:color w:val="1E6CB8"/>
+          <w:color w:val="0060AA"/>
           <w:sz w:val="26"/>
           <w:szCs w:val="26"/>
         </w:rPr>
@@ -2321,21 +2423,35 @@
 <w:ftr xmlns:wpc="http://schemas.microsoft.com/office/word/2010/wordprocessingCanvas" xmlns:mc="http://schemas.openxmlformats.org/markup-compatibility/2006" xmlns:o="urn:schemas-microsoft-com:office:office" xmlns:r="http://schemas.openxmlformats.org/officeDocument/2006/relationships" xmlns:m="http://schemas.openxmlformats.org/officeDocument/2006/math" xmlns:v="urn:schemas-microsoft-com:vml" xmlns:wp14="http://schemas.microsoft.com/office/word/2010/wordprocessingDrawing" xmlns:wp="http://schemas.openxmlformats.org/drawingml/2006/wordprocessingDrawing" xmlns:w10="urn:schemas-microsoft-com:office:word" xmlns:w="http://schemas.openxmlformats.org/wordprocessingml/2006/main" xmlns:w14="http://schemas.microsoft.com/office/word/2010/wordml" xmlns:w15="http://schemas.microsoft.com/office/word/2012/wordml" xmlns:wpg="http://schemas.microsoft.com/office/word/2010/wordprocessingGroup" xmlns:wpi="http://schemas.microsoft.com/office/word/2010/wordprocessingInk" xmlns:wne="http://schemas.microsoft.com/office/word/2006/wordml" xmlns:wps="http://schemas.microsoft.com/office/word/2010/wordprocessingShape">
   <w:p>
     <w:pPr>
+      <w:pBdr>
+        <w:top w:val="single" w:color="0060AA" w:sz="8" w:space="4"/>
+      </w:pBdr>
       <w:jc w:val="center"/>
     </w:pPr>
     <w:r>
       <w:rPr>
         <w:rFonts w:ascii="Calibri" w:cs="Calibri" w:eastAsia="Calibri" w:hAnsi="Calibri"/>
-        <w:color w:val="5A6B7D"/>
+        <w:b/>
+        <w:bCs/>
+        <w:color w:val="0060AA"/>
         <w:sz w:val="17"/>
         <w:szCs w:val="17"/>
       </w:rPr>
-      <w:t xml:space="preserve">Centrum pro léčbu bolesti a paliativní medicínu s.r.o. Zlín · říjen 2026 · strana </w:t>
+      <w:t xml:space="preserve">Centrum pro léčbu bolesti a paliativní medicínu s.r.o. Zlín</w:t>
     </w:r>
     <w:r>
       <w:rPr>
         <w:rFonts w:ascii="Calibri" w:cs="Calibri" w:eastAsia="Calibri" w:hAnsi="Calibri"/>
-        <w:color w:val="5A6B7D"/>
+        <w:color w:val="55657A"/>
+        <w:sz w:val="17"/>
+        <w:szCs w:val="17"/>
+      </w:rPr>
+      <w:t xml:space="preserve"> · www.centrumlb.cz · říjen 2026 · strana </w:t>
+    </w:r>
+    <w:r>
+      <w:rPr>
+        <w:rFonts w:ascii="Calibri" w:cs="Calibri" w:eastAsia="Calibri" w:hAnsi="Calibri"/>
+        <w:color w:val="55657A"/>
         <w:sz w:val="17"/>
         <w:szCs w:val="17"/>
       </w:rPr>
@@ -2394,11 +2510,22 @@
     <w:r>
       <w:rPr>
         <w:rFonts w:ascii="Calibri" w:cs="Calibri" w:eastAsia="Calibri" w:hAnsi="Calibri"/>
-        <w:color w:val="5A6B7D"/>
+        <w:color w:val="55657A"/>
         <w:sz w:val="17"/>
         <w:szCs w:val="17"/>
       </w:rPr>
-      <w:t xml:space="preserve">PéčeDoma a Karta pacienta on-line · leták pro lékaře a sestry · CLB Zlín</w:t>
+      <w:t xml:space="preserve">PéčeDoma a Karta pacienta on-line · leták pro lékaře a sestry · </w:t>
+    </w:r>
+    <w:r>
+      <w:rPr>
+        <w:rFonts w:ascii="Calibri" w:cs="Calibri" w:eastAsia="Calibri" w:hAnsi="Calibri"/>
+        <w:b/>
+        <w:bCs/>
+        <w:color w:val="0060AA"/>
+        <w:sz w:val="17"/>
+        <w:szCs w:val="17"/>
+      </w:rPr>
+      <w:t xml:space="preserve">Centrum pro léčbu bolesti a paliativní medicínu Zlín</w:t>
     </w:r>
   </w:p>
 </w:hdr>

</xml_diff>

<commit_message>
Leták: agendy z Famicury jsou v PéčeDoma
Co-Authored-By: Claude Fable 5.1 <noreply@anthropic.com>
Claude-Session: https://claude.ai/code/session_01DHM73js1aX8r6xC8bdzJ6d
</commit_message>
<xml_diff>
--- a/docs/letak-pecedoma-karta-pacienta.docx
+++ b/docs/letak-pecedoma-karta-pacienta.docx
@@ -174,12 +174,13 @@
           <w:sz w:val="19"/>
           <w:szCs w:val="19"/>
         </w:rPr>
-        <w:t xml:space="preserve">PéčeDoma je pracovní portál týmu – plánujeme, zapisujeme a sledujeme péči. Karta pacienta on-line je paliativní průkaz – to, co musí být u lůžka pro rodinu, záchrannou službu i lékaře ve službě, i bez signálu. Většinu práce dělá tým v PéčeDoma, Karta si z ní údaje bere sama.</w:t>
+        <w:t xml:space="preserve">PéčeDoma je pracovní portál týmu – plánujeme, zapisujeme a sledujeme péči; jsou v něm všechny potřebné agendy z Famicury, takže Famicuru už k práci nepotřebujete. Karta pacienta on-line je paliativní průkaz – to, co musí být u lůžka pro rodinu, záchrannou službu i lékaře ve službě, i bez signálu. Většinu práce dělá tým v PéčeDoma, Karta si z ní údaje bere sama.</w:t>
       </w:r>
     </w:p>
     <w:p>
       <w:pPr>
         <w:pStyle w:val="Heading1"/>
+        <w:keepNext/>
         <w:spacing w:after="70" w:before="160"/>
       </w:pPr>
       <w:r>
@@ -731,6 +732,7 @@
     <w:p>
       <w:pPr>
         <w:pStyle w:val="Heading1"/>
+        <w:keepNext/>
         <w:spacing w:after="70" w:before="160"/>
       </w:pPr>
       <w:r>
@@ -743,6 +745,34 @@
           <w:szCs w:val="26"/>
         </w:rPr>
         <w:t xml:space="preserve">2. PéčeDoma – pracovní portál týmu</w:t>
+      </w:r>
+    </w:p>
+    <w:p>
+      <w:pPr>
+        <w:pBdr>
+          <w:left w:val="single" w:color="E09B2D" w:sz="18" w:space="6"/>
+        </w:pBdr>
+        <w:shd w:fill="FFF6E5" w:color="auto" w:val="clear"/>
+        <w:spacing w:after="120" w:before="60"/>
+        <w:ind w:left="120"/>
+      </w:pPr>
+      <w:r>
+        <w:rPr>
+          <w:rFonts w:ascii="Calibri" w:cs="Calibri" w:eastAsia="Calibri" w:hAnsi="Calibri"/>
+          <w:b/>
+          <w:bCs/>
+          <w:sz w:val="19"/>
+          <w:szCs w:val="19"/>
+        </w:rPr>
+        <w:t xml:space="preserve">Famicura → PéčeDoma: </w:t>
+      </w:r>
+      <w:r>
+        <w:rPr>
+          <w:rFonts w:ascii="Calibri" w:cs="Calibri" w:eastAsia="Calibri" w:hAnsi="Calibri"/>
+          <w:sz w:val="19"/>
+          <w:szCs w:val="19"/>
+        </w:rPr>
+        <w:t xml:space="preserve">všechny potřebné agendy z Famicury (klienti, plán návštěv, léky, zprávy, formuláře, reporty) jsou v PéčeDoma. Pracujte jen v PéčeDoma, Famicuru už neotevírejte.</w:t>
       </w:r>
     </w:p>
     <w:p>
@@ -899,6 +929,7 @@
     <w:p>
       <w:pPr>
         <w:pStyle w:val="Heading1"/>
+        <w:keepNext/>
         <w:spacing w:after="70" w:before="160"/>
       </w:pPr>
       <w:r>
@@ -1230,6 +1261,7 @@
     <w:p>
       <w:pPr>
         <w:pStyle w:val="Heading2"/>
+        <w:keepNext/>
         <w:spacing w:after="40" w:before="110"/>
       </w:pPr>
       <w:r>
@@ -1339,6 +1371,8 @@
     <w:p>
       <w:pPr>
         <w:pStyle w:val="Heading2"/>
+        <w:keepNext/>
+        <w:pageBreakBefore/>
         <w:spacing w:after="40" w:before="110"/>
       </w:pPr>
       <w:r>
@@ -1369,6 +1403,7 @@
     <w:p>
       <w:pPr>
         <w:pStyle w:val="Heading1"/>
+        <w:keepNext/>
         <w:spacing w:after="70" w:before="160"/>
       </w:pPr>
       <w:r>
@@ -2022,6 +2057,7 @@
     <w:p>
       <w:pPr>
         <w:pStyle w:val="Heading1"/>
+        <w:keepNext/>
         <w:spacing w:after="70" w:before="160"/>
       </w:pPr>
       <w:r>
@@ -2039,6 +2075,7 @@
     <w:p>
       <w:pPr>
         <w:pStyle w:val="Heading2"/>
+        <w:keepNext/>
         <w:spacing w:after="40" w:before="110"/>
       </w:pPr>
       <w:r>
@@ -2092,6 +2129,7 @@
     <w:p>
       <w:pPr>
         <w:pStyle w:val="Heading2"/>
+        <w:keepNext/>
         <w:spacing w:after="40" w:before="110"/>
       </w:pPr>
       <w:r>
@@ -2127,6 +2165,7 @@
     <w:p>
       <w:pPr>
         <w:pStyle w:val="Heading2"/>
+        <w:keepNext/>
         <w:spacing w:after="40" w:before="110"/>
       </w:pPr>
       <w:r>
@@ -2162,6 +2201,7 @@
     <w:p>
       <w:pPr>
         <w:pStyle w:val="Heading2"/>
+        <w:keepNext/>
         <w:spacing w:after="40" w:before="110"/>
       </w:pPr>
       <w:r>
@@ -2197,6 +2237,7 @@
     <w:p>
       <w:pPr>
         <w:pStyle w:val="Heading2"/>
+        <w:keepNext/>
         <w:spacing w:after="40" w:before="110"/>
       </w:pPr>
       <w:r>
@@ -2232,6 +2273,7 @@
     <w:p>
       <w:pPr>
         <w:pStyle w:val="Heading1"/>
+        <w:keepNext/>
         <w:spacing w:after="70" w:before="160"/>
       </w:pPr>
       <w:r>

</xml_diff>

<commit_message>
Leták: první zpráva – Modrou hlavu nahrazuje PéčeDoma, agendy z Famicury
Co-Authored-By: Claude Fable 5.1 <noreply@anthropic.com>
Claude-Session: https://claude.ai/code/session_01DHM73js1aX8r6xC8bdzJ6d
</commit_message>
<xml_diff>
--- a/docs/letak-pecedoma-karta-pacienta.docx
+++ b/docs/letak-pecedoma-karta-pacienta.docx
@@ -156,6 +156,48 @@
     </w:p>
     <w:p>
       <w:pPr>
+        <w:pBdr>
+          <w:top w:val="single" w:color="B9CDE3" w:sz="4" w:space="4"/>
+          <w:bottom w:val="single" w:color="B9CDE3" w:sz="4" w:space="4"/>
+          <w:left w:val="single" w:color="D52B1E" w:sz="24" w:space="6"/>
+          <w:right w:val="single" w:color="B9CDE3" w:sz="4" w:space="4"/>
+        </w:pBdr>
+        <w:shd w:fill="E4EEF8" w:color="auto" w:val="clear"/>
+        <w:spacing w:after="140" w:before="0"/>
+        <w:ind w:left="120" w:right="120"/>
+      </w:pPr>
+      <w:r>
+        <w:rPr>
+          <w:rFonts w:ascii="Calibri" w:cs="Calibri" w:eastAsia="Calibri" w:hAnsi="Calibri"/>
+          <w:b/>
+          <w:bCs/>
+          <w:color w:val="D52B1E"/>
+          <w:sz w:val="20"/>
+          <w:szCs w:val="20"/>
+        </w:rPr>
+        <w:t xml:space="preserve">DŮLEŽITÉ: </w:t>
+      </w:r>
+      <w:r>
+        <w:rPr>
+          <w:rFonts w:ascii="Calibri" w:cs="Calibri" w:eastAsia="Calibri" w:hAnsi="Calibri"/>
+          <w:b/>
+          <w:bCs/>
+          <w:sz w:val="19"/>
+          <w:szCs w:val="19"/>
+        </w:rPr>
+        <w:t xml:space="preserve">Modrá hlava se pro pracovníky hospice stává minulostí – nahrazuje ji PéčeDoma (modrý domeček). </w:t>
+      </w:r>
+      <w:r>
+        <w:rPr>
+          <w:rFonts w:ascii="Calibri" w:cs="Calibri" w:eastAsia="Calibri" w:hAnsi="Calibri"/>
+          <w:sz w:val="20"/>
+          <w:szCs w:val="20"/>
+        </w:rPr>
+        <w:t xml:space="preserve">Všechny potřebné agendy z Famicury – klienti, plán návštěv, léky, zprávy, formuláře, reporty – jsou v PéčeDoma. Pracujte jen v PéčeDoma; Modrou hlavu ani Famicuru už k práci nepotřebujete.</w:t>
+      </w:r>
+    </w:p>
+    <w:p>
+      <w:pPr>
         <w:spacing w:after="70" w:line="252"/>
       </w:pPr>
       <w:r>
@@ -174,7 +216,7 @@
           <w:sz w:val="19"/>
           <w:szCs w:val="19"/>
         </w:rPr>
-        <w:t xml:space="preserve">PéčeDoma je pracovní portál týmu – plánujeme, zapisujeme a sledujeme péči; jsou v něm všechny potřebné agendy z Famicury, takže Famicuru už k práci nepotřebujete. Karta pacienta on-line je paliativní průkaz – to, co musí být u lůžka pro rodinu, záchrannou službu i lékaře ve službě, i bez signálu. Většinu práce dělá tým v PéčeDoma, Karta si z ní údaje bere sama.</w:t>
+        <w:t xml:space="preserve">PéčeDoma je pracovní portál týmu – plánujeme, zapisujeme a sledujeme péči. Karta pacienta on-line je paliativní průkaz – to, co musí být u lůžka pro rodinu, záchrannou službu i lékaře ve službě, i bez signálu. Většinu práce dělá tým v PéčeDoma, Karta si z ní údaje bere sama.</w:t>
       </w:r>
     </w:p>
     <w:p>
@@ -745,34 +787,6 @@
           <w:szCs w:val="26"/>
         </w:rPr>
         <w:t xml:space="preserve">2. PéčeDoma – pracovní portál týmu</w:t>
-      </w:r>
-    </w:p>
-    <w:p>
-      <w:pPr>
-        <w:pBdr>
-          <w:left w:val="single" w:color="E09B2D" w:sz="18" w:space="6"/>
-        </w:pBdr>
-        <w:shd w:fill="FFF6E5" w:color="auto" w:val="clear"/>
-        <w:spacing w:after="120" w:before="60"/>
-        <w:ind w:left="120"/>
-      </w:pPr>
-      <w:r>
-        <w:rPr>
-          <w:rFonts w:ascii="Calibri" w:cs="Calibri" w:eastAsia="Calibri" w:hAnsi="Calibri"/>
-          <w:b/>
-          <w:bCs/>
-          <w:sz w:val="19"/>
-          <w:szCs w:val="19"/>
-        </w:rPr>
-        <w:t xml:space="preserve">Famicura → PéčeDoma: </w:t>
-      </w:r>
-      <w:r>
-        <w:rPr>
-          <w:rFonts w:ascii="Calibri" w:cs="Calibri" w:eastAsia="Calibri" w:hAnsi="Calibri"/>
-          <w:sz w:val="19"/>
-          <w:szCs w:val="19"/>
-        </w:rPr>
-        <w:t xml:space="preserve">všechny potřebné agendy z Famicury (klienti, plán návštěv, léky, zprávy, formuláře, reporty) jsou v PéčeDoma. Pracujte jen v PéčeDoma, Famicuru už neotevírejte.</w:t>
       </w:r>
     </w:p>
     <w:p>

</xml_diff>